<commit_message>
chlorophyll data: summary stats generated
</commit_message>
<xml_diff>
--- a/writing/Chapter 2.docx
+++ b/writing/Chapter 2.docx
@@ -67,6 +67,27 @@
       <w:pPr>
         <w:rPr>
           <w:rFonts w:ascii="Arial" w:hAnsi="Arial" w:cs="Arial"/>
+          <w:b/>
+          <w:bCs/>
+          <w:sz w:val="28"/>
+          <w:szCs w:val="28"/>
+        </w:rPr>
+      </w:pPr>
+      <w:r>
+        <w:rPr>
+          <w:rFonts w:ascii="Arial" w:hAnsi="Arial" w:cs="Arial"/>
+          <w:b/>
+          <w:bCs/>
+          <w:sz w:val="28"/>
+          <w:szCs w:val="28"/>
+        </w:rPr>
+        <w:t xml:space="preserve">April 3 - </w:t>
+      </w:r>
+    </w:p>
+    <w:p>
+      <w:pPr>
+        <w:rPr>
+          <w:rFonts w:ascii="Arial" w:hAnsi="Arial" w:cs="Arial"/>
           <w:sz w:val="28"/>
           <w:szCs w:val="28"/>
         </w:rPr>
@@ -257,8 +278,18 @@
           <w:i/>
           <w:iCs/>
         </w:rPr>
-        <w:t>Crassostrea sikamea</w:t>
+        <w:t xml:space="preserve">Crassostrea </w:t>
       </w:r>
+      <w:proofErr w:type="spellStart"/>
+      <w:r>
+        <w:rPr>
+          <w:rFonts w:ascii="Arial" w:hAnsi="Arial" w:cs="Arial"/>
+          <w:i/>
+          <w:iCs/>
+        </w:rPr>
+        <w:t>sikamea</w:t>
+      </w:r>
+      <w:proofErr w:type="spellEnd"/>
       <w:r>
         <w:rPr>
           <w:rFonts w:ascii="Arial" w:hAnsi="Arial" w:cs="Arial"/>
@@ -273,6 +304,7 @@
           <w:rFonts w:ascii="Arial" w:hAnsi="Arial" w:cs="Arial"/>
         </w:rPr>
       </w:pPr>
+      <w:proofErr w:type="spellStart"/>
       <w:r>
         <w:rPr>
           <w:rFonts w:ascii="Arial" w:hAnsi="Arial" w:cs="Arial"/>
@@ -289,6 +321,7 @@
         </w:rPr>
         <w:t>agallana</w:t>
       </w:r>
+      <w:proofErr w:type="spellEnd"/>
       <w:r>
         <w:rPr>
           <w:rFonts w:ascii="Arial" w:hAnsi="Arial" w:cs="Arial"/>
@@ -341,137 +374,123 @@
         <w:ind w:firstLine="720"/>
         <w:rPr>
           <w:rFonts w:ascii="Arial" w:hAnsi="Arial" w:cs="Arial"/>
-          <w:color w:val="7030A0"/>
         </w:rPr>
       </w:pPr>
       <w:r>
         <w:rPr>
           <w:rFonts w:ascii="Arial" w:hAnsi="Arial" w:cs="Arial"/>
-          <w:color w:val="7030A0"/>
         </w:rPr>
         <w:t xml:space="preserve">Stress hardening was not conducted 2020 to get a baseline for how disease and temperature impacts may manifest in oysters. </w:t>
       </w:r>
       <w:r>
         <w:rPr>
           <w:rFonts w:ascii="Arial" w:hAnsi="Arial" w:cs="Arial"/>
-          <w:color w:val="7030A0"/>
-        </w:rPr>
-        <w:t>Prior to outplanting</w:t>
+        </w:rPr>
+        <w:t xml:space="preserve">Prior to </w:t>
+      </w:r>
+      <w:proofErr w:type="spellStart"/>
+      <w:r>
+        <w:rPr>
+          <w:rFonts w:ascii="Arial" w:hAnsi="Arial" w:cs="Arial"/>
+        </w:rPr>
+        <w:t>outplanting</w:t>
+      </w:r>
+      <w:proofErr w:type="spellEnd"/>
+      <w:r>
+        <w:rPr>
+          <w:rFonts w:ascii="Arial" w:hAnsi="Arial" w:cs="Arial"/>
+        </w:rPr>
+        <w:t xml:space="preserve">, oysters were kept in flow-through Bodega Marine Lab </w:t>
       </w:r>
       <w:r>
         <w:rPr>
           <w:rFonts w:ascii="Arial" w:hAnsi="Arial" w:cs="Arial"/>
-          <w:color w:val="7030A0"/>
-        </w:rPr>
-        <w:t>, oysters were kept in flow-through Bodega Marine Lab</w:t>
+        </w:rPr>
+        <w:t xml:space="preserve">for two weeks </w:t>
       </w:r>
       <w:r>
         <w:rPr>
           <w:rFonts w:ascii="Arial" w:hAnsi="Arial" w:cs="Arial"/>
-          <w:color w:val="7030A0"/>
+        </w:rPr>
+        <w:t xml:space="preserve">and fed daily on a </w:t>
+      </w:r>
+      <w:r>
+        <w:rPr>
+          <w:rFonts w:ascii="Arial" w:hAnsi="Arial" w:cs="Arial"/>
+        </w:rPr>
+        <w:t xml:space="preserve">combined </w:t>
+      </w:r>
+      <w:r>
+        <w:rPr>
+          <w:rFonts w:ascii="Arial" w:hAnsi="Arial" w:cs="Arial"/>
+        </w:rPr>
+        <w:t xml:space="preserve">diet of </w:t>
+      </w:r>
+      <w:r>
+        <w:rPr>
+          <w:rFonts w:ascii="Arial" w:hAnsi="Arial" w:cs="Arial"/>
+        </w:rPr>
+        <w:t>Shellfish Diet 1800</w:t>
+      </w:r>
+      <w:r>
+        <w:rPr>
+          <w:rFonts w:ascii="Arial" w:hAnsi="Arial" w:cs="Arial"/>
+        </w:rPr>
+        <w:t xml:space="preserve"> (</w:t>
+      </w:r>
+      <w:r>
+        <w:rPr>
+          <w:rFonts w:ascii="Arial" w:hAnsi="Arial" w:cs="Arial"/>
+        </w:rPr>
+        <w:t>Reed Mariculture</w:t>
+      </w:r>
+      <w:r>
+        <w:rPr>
+          <w:rFonts w:ascii="Arial" w:hAnsi="Arial" w:cs="Arial"/>
+        </w:rPr>
+        <w:t>) and microalgal feed consisting of</w:t>
+      </w:r>
+      <w:r>
+        <w:rPr>
+          <w:rFonts w:ascii="Arial" w:hAnsi="Arial" w:cs="Arial"/>
+        </w:rPr>
+        <w:t xml:space="preserve"> </w:t>
+      </w:r>
+      <w:proofErr w:type="spellStart"/>
+      <w:r>
+        <w:rPr>
+          <w:rFonts w:ascii="Arial" w:hAnsi="Arial" w:cs="Arial"/>
+          <w:i/>
+          <w:iCs/>
+        </w:rPr>
+        <w:t>Nanochloropsis</w:t>
+      </w:r>
+      <w:proofErr w:type="spellEnd"/>
+      <w:r>
+        <w:rPr>
+          <w:rFonts w:ascii="Arial" w:hAnsi="Arial" w:cs="Arial"/>
         </w:rPr>
         <w:t xml:space="preserve"> </w:t>
       </w:r>
       <w:r>
         <w:rPr>
           <w:rFonts w:ascii="Arial" w:hAnsi="Arial" w:cs="Arial"/>
-          <w:color w:val="7030A0"/>
-        </w:rPr>
-        <w:t xml:space="preserve">for two weeks </w:t>
+        </w:rPr>
+        <w:t xml:space="preserve">and </w:t>
       </w:r>
-      <w:r>
-        <w:rPr>
-          <w:rFonts w:ascii="Arial" w:hAnsi="Arial" w:cs="Arial"/>
-          <w:color w:val="7030A0"/>
-        </w:rPr>
-        <w:t xml:space="preserve">and fed daily on a </w:t>
-      </w:r>
-      <w:r>
-        <w:rPr>
-          <w:rFonts w:ascii="Arial" w:hAnsi="Arial" w:cs="Arial"/>
-          <w:color w:val="7030A0"/>
-        </w:rPr>
-        <w:t xml:space="preserve">combined </w:t>
-      </w:r>
-      <w:r>
-        <w:rPr>
-          <w:rFonts w:ascii="Arial" w:hAnsi="Arial" w:cs="Arial"/>
-          <w:color w:val="7030A0"/>
-        </w:rPr>
-        <w:t xml:space="preserve">diet of </w:t>
-      </w:r>
-      <w:r>
-        <w:rPr>
-          <w:rFonts w:ascii="Arial" w:hAnsi="Arial" w:cs="Arial"/>
-          <w:color w:val="7030A0"/>
-        </w:rPr>
-        <w:t>Shellfish Diet 1800</w:t>
-      </w:r>
-      <w:r>
-        <w:rPr>
-          <w:rFonts w:ascii="Arial" w:hAnsi="Arial" w:cs="Arial"/>
-          <w:color w:val="7030A0"/>
-        </w:rPr>
-        <w:t xml:space="preserve"> (</w:t>
-      </w:r>
-      <w:r>
-        <w:rPr>
-          <w:rFonts w:ascii="Arial" w:hAnsi="Arial" w:cs="Arial"/>
-          <w:color w:val="7030A0"/>
-          <w:highlight w:val="yellow"/>
-        </w:rPr>
-        <w:t>XX COMPANY</w:t>
-      </w:r>
-      <w:r>
-        <w:rPr>
-          <w:rFonts w:ascii="Arial" w:hAnsi="Arial" w:cs="Arial"/>
-          <w:color w:val="7030A0"/>
-        </w:rPr>
-        <w:t>) and microalgal feed consisting of</w:t>
-      </w:r>
-      <w:r>
-        <w:rPr>
-          <w:rFonts w:ascii="Arial" w:hAnsi="Arial" w:cs="Arial"/>
-          <w:color w:val="7030A0"/>
-        </w:rPr>
-        <w:t xml:space="preserve"> </w:t>
-      </w:r>
+      <w:proofErr w:type="spellStart"/>
       <w:r>
         <w:rPr>
           <w:rFonts w:ascii="Arial" w:hAnsi="Arial" w:cs="Arial"/>
           <w:i/>
           <w:iCs/>
-          <w:color w:val="7030A0"/>
-        </w:rPr>
-        <w:t>Nanochloropsis</w:t>
-      </w:r>
-      <w:r>
-        <w:rPr>
-          <w:rFonts w:ascii="Arial" w:hAnsi="Arial" w:cs="Arial"/>
-          <w:color w:val="7030A0"/>
-        </w:rPr>
-        <w:t xml:space="preserve"> </w:t>
-      </w:r>
-      <w:r>
-        <w:rPr>
-          <w:rFonts w:ascii="Arial" w:hAnsi="Arial" w:cs="Arial"/>
-          <w:color w:val="7030A0"/>
-        </w:rPr>
-        <w:t xml:space="preserve">and </w:t>
-      </w:r>
-      <w:r>
-        <w:rPr>
-          <w:rFonts w:ascii="Arial" w:hAnsi="Arial" w:cs="Arial"/>
-          <w:i/>
-          <w:iCs/>
-          <w:color w:val="7030A0"/>
         </w:rPr>
         <w:t>Isochyrsis</w:t>
       </w:r>
+      <w:proofErr w:type="spellEnd"/>
       <w:r>
         <w:rPr>
           <w:rFonts w:ascii="Arial" w:hAnsi="Arial" w:cs="Arial"/>
-          <w:color w:val="7030A0"/>
         </w:rPr>
         <w:t>.</w:t>
       </w:r>
@@ -481,20 +500,17 @@
         <w:ind w:firstLine="720"/>
         <w:rPr>
           <w:rFonts w:ascii="Arial" w:hAnsi="Arial" w:cs="Arial"/>
-          <w:color w:val="7030A0"/>
         </w:rPr>
       </w:pPr>
       <w:r>
         <w:rPr>
           <w:rFonts w:ascii="Arial" w:hAnsi="Arial" w:cs="Arial"/>
-          <w:color w:val="7030A0"/>
         </w:rPr>
         <w:t>In 202</w:t>
       </w:r>
       <w:r>
         <w:rPr>
           <w:rFonts w:ascii="Arial" w:hAnsi="Arial" w:cs="Arial"/>
-          <w:color w:val="7030A0"/>
         </w:rPr>
         <w:t>1, Kumamoto (</w:t>
       </w:r>
@@ -503,51 +519,58 @@
           <w:rFonts w:ascii="Arial" w:hAnsi="Arial" w:cs="Arial"/>
           <w:i/>
           <w:iCs/>
-          <w:color w:val="7030A0"/>
-        </w:rPr>
-        <w:t>Crassostrea sikamea</w:t>
+        </w:rPr>
+        <w:t xml:space="preserve">Crassostrea </w:t>
+      </w:r>
+      <w:proofErr w:type="spellStart"/>
+      <w:r>
+        <w:rPr>
+          <w:rFonts w:ascii="Arial" w:hAnsi="Arial" w:cs="Arial"/>
+          <w:i/>
+          <w:iCs/>
+        </w:rPr>
+        <w:t>sikamea</w:t>
+      </w:r>
+      <w:proofErr w:type="spellEnd"/>
+      <w:r>
+        <w:rPr>
+          <w:rFonts w:ascii="Arial" w:hAnsi="Arial" w:cs="Arial"/>
+        </w:rPr>
+        <w:t>) and Pacific (</w:t>
+      </w:r>
+      <w:proofErr w:type="spellStart"/>
+      <w:r>
+        <w:rPr>
+          <w:rFonts w:ascii="Arial" w:hAnsi="Arial" w:cs="Arial"/>
+          <w:i/>
+          <w:iCs/>
+        </w:rPr>
+        <w:t>Magallana</w:t>
+      </w:r>
+      <w:proofErr w:type="spellEnd"/>
+      <w:r>
+        <w:rPr>
+          <w:rFonts w:ascii="Arial" w:hAnsi="Arial" w:cs="Arial"/>
+          <w:i/>
+          <w:iCs/>
+        </w:rPr>
+        <w:t xml:space="preserve"> gigas</w:t>
       </w:r>
       <w:r>
         <w:rPr>
           <w:rFonts w:ascii="Arial" w:hAnsi="Arial" w:cs="Arial"/>
-          <w:color w:val="7030A0"/>
-        </w:rPr>
-        <w:t>) an</w:t>
-      </w:r>
-      <w:r>
-        <w:rPr>
-          <w:rFonts w:ascii="Arial" w:hAnsi="Arial" w:cs="Arial"/>
-          <w:color w:val="7030A0"/>
-        </w:rPr>
-        <w:t>d Pacific (</w:t>
-      </w:r>
-      <w:r>
-        <w:rPr>
-          <w:rFonts w:ascii="Arial" w:hAnsi="Arial" w:cs="Arial"/>
-          <w:i/>
-          <w:iCs/>
-          <w:color w:val="7030A0"/>
-        </w:rPr>
-        <w:t>Magallana gigas</w:t>
-      </w:r>
-      <w:r>
-        <w:rPr>
-          <w:rFonts w:ascii="Arial" w:hAnsi="Arial" w:cs="Arial"/>
-          <w:color w:val="7030A0"/>
         </w:rPr>
         <w:t>)</w:t>
       </w:r>
       <w:r>
         <w:rPr>
           <w:rFonts w:ascii="Arial" w:hAnsi="Arial" w:cs="Arial"/>
-          <w:color w:val="7030A0"/>
         </w:rPr>
         <w:t xml:space="preserve"> oysters </w:t>
       </w:r>
       <w:r>
         <w:rPr>
           <w:rFonts w:ascii="Arial" w:hAnsi="Arial" w:cs="Arial"/>
-          <w:color w:val="7030A0"/>
         </w:rPr>
         <w:t>were stress hardened.</w:t>
       </w:r>
@@ -646,80 +669,139 @@
         <w:ind w:left="720" w:firstLine="720"/>
         <w:rPr>
           <w:rFonts w:ascii="Arial" w:hAnsi="Arial" w:cs="Arial"/>
-          <w:color w:val="7030A0"/>
         </w:rPr>
       </w:pPr>
       <w:r>
         <w:rPr>
           <w:rFonts w:ascii="Arial" w:hAnsi="Arial" w:cs="Arial"/>
-          <w:color w:val="7030A0"/>
-        </w:rPr>
-        <w:t>Data</w:t>
+        </w:rPr>
+        <w:t xml:space="preserve">Data were collected on </w:t>
       </w:r>
       <w:r>
         <w:rPr>
           <w:rFonts w:ascii="Arial" w:hAnsi="Arial" w:cs="Arial"/>
-          <w:color w:val="7030A0"/>
-        </w:rPr>
-        <w:t xml:space="preserve"> were collected on </w:t>
-      </w:r>
-      <w:r>
-        <w:rPr>
-          <w:rFonts w:ascii="Arial" w:hAnsi="Arial" w:cs="Arial"/>
-          <w:color w:val="7030A0"/>
         </w:rPr>
         <w:t>temperature</w:t>
       </w:r>
       <w:r>
         <w:rPr>
           <w:rFonts w:ascii="Arial" w:hAnsi="Arial" w:cs="Arial"/>
-          <w:color w:val="7030A0"/>
         </w:rPr>
         <w:t xml:space="preserve"> loggers</w:t>
       </w:r>
       <w:r>
         <w:rPr>
           <w:rFonts w:ascii="Arial" w:hAnsi="Arial" w:cs="Arial"/>
-          <w:color w:val="7030A0"/>
         </w:rPr>
         <w:t xml:space="preserve"> (Onset, HOBO)</w:t>
       </w:r>
       <w:r>
         <w:rPr>
           <w:rFonts w:ascii="Arial" w:hAnsi="Arial" w:cs="Arial"/>
-          <w:color w:val="7030A0"/>
-        </w:rPr>
-        <w:t xml:space="preserve"> and paired with tide data from NOAA (Reynolds, Blake’s Landing, and Tomales Bay Entrance tidal stations were coupled with the North, Middle, and South sites, respectively.)</w:t>
+        </w:rPr>
+        <w:t xml:space="preserve"> and paired with tide data from NOAA (Reynolds, Blake’s Landing, and </w:t>
+      </w:r>
+      <w:proofErr w:type="spellStart"/>
+      <w:r>
+        <w:rPr>
+          <w:rFonts w:ascii="Arial" w:hAnsi="Arial" w:cs="Arial"/>
+        </w:rPr>
+        <w:t>Tomales</w:t>
+      </w:r>
+      <w:proofErr w:type="spellEnd"/>
+      <w:r>
+        <w:rPr>
+          <w:rFonts w:ascii="Arial" w:hAnsi="Arial" w:cs="Arial"/>
+        </w:rPr>
+        <w:t xml:space="preserve"> Bay Entrance tidal stations were coupled with the North, Middle, and South sites, respectively.)</w:t>
       </w:r>
       <w:r>
         <w:rPr>
           <w:rFonts w:ascii="Arial" w:hAnsi="Arial" w:cs="Arial"/>
-          <w:color w:val="7030A0"/>
-        </w:rPr>
-        <w:t xml:space="preserve"> to approximate when oysters were experiencing high and low tide in Tomales Bay. When oysters were </w:t>
+        </w:rPr>
+        <w:t xml:space="preserve"> to approximate </w:t>
       </w:r>
       <w:r>
         <w:rPr>
           <w:rFonts w:ascii="Arial" w:hAnsi="Arial" w:cs="Arial"/>
-          <w:color w:val="7030A0"/>
         </w:rPr>
         <w:lastRenderedPageBreak/>
-        <w:t>experiencing low tide, it was assumed they were experiencing the temperatures measured by the logger deployed at the center of the line. When it was high tide, aerial loggers deployed six feet above the surface would</w:t>
+        <w:t xml:space="preserve">when oysters were experiencing high and low tide in </w:t>
+      </w:r>
+      <w:proofErr w:type="spellStart"/>
+      <w:r>
+        <w:rPr>
+          <w:rFonts w:ascii="Arial" w:hAnsi="Arial" w:cs="Arial"/>
+        </w:rPr>
+        <w:t>Tomales</w:t>
+      </w:r>
+      <w:proofErr w:type="spellEnd"/>
+      <w:r>
+        <w:rPr>
+          <w:rFonts w:ascii="Arial" w:hAnsi="Arial" w:cs="Arial"/>
+        </w:rPr>
+        <w:t xml:space="preserve"> Bay. When oysters were experiencing low tide, it was assumed they were experiencing the temperatures measured by the logger deployed at the center of the line. When it was high tide, aerial loggers deployed six feet above the surface would</w:t>
       </w:r>
       <w:r>
         <w:rPr>
           <w:rFonts w:ascii="Arial" w:hAnsi="Arial" w:cs="Arial"/>
-          <w:color w:val="7030A0"/>
         </w:rPr>
         <w:t xml:space="preserve"> were used the determine the temperatures oysters were experiencing</w:t>
       </w:r>
       <w:r>
         <w:rPr>
           <w:rFonts w:ascii="Arial" w:hAnsi="Arial" w:cs="Arial"/>
-          <w:color w:val="7030A0"/>
         </w:rPr>
         <w:t>.</w:t>
       </w:r>
+    </w:p>
+    <w:p>
+      <w:pPr>
+        <w:rPr>
+          <w:rFonts w:ascii="Arial" w:hAnsi="Arial" w:cs="Arial"/>
+          <w:color w:val="7030A0"/>
+        </w:rPr>
+      </w:pPr>
+    </w:p>
+    <w:p>
+      <w:pPr>
+        <w:ind w:firstLine="720"/>
+        <w:rPr>
+          <w:rFonts w:ascii="Arial" w:hAnsi="Arial" w:cs="Arial"/>
+          <w:b/>
+          <w:bCs/>
+          <w:i/>
+          <w:iCs/>
+        </w:rPr>
+      </w:pPr>
+      <w:r>
+        <w:rPr>
+          <w:rFonts w:ascii="Arial" w:hAnsi="Arial" w:cs="Arial"/>
+          <w:b/>
+          <w:bCs/>
+          <w:i/>
+          <w:iCs/>
+        </w:rPr>
+        <w:t>Chlorophyll</w:t>
+      </w:r>
+      <w:r>
+        <w:rPr>
+          <w:rFonts w:ascii="Arial" w:hAnsi="Arial" w:cs="Arial"/>
+          <w:b/>
+          <w:bCs/>
+          <w:i/>
+          <w:iCs/>
+        </w:rPr>
+        <w:t xml:space="preserve"> in the Field</w:t>
+      </w:r>
+    </w:p>
+    <w:p>
+      <w:pPr>
+        <w:rPr>
+          <w:rFonts w:ascii="Arial" w:hAnsi="Arial" w:cs="Arial"/>
+          <w:color w:val="7030A0"/>
+        </w:rPr>
+      </w:pPr>
     </w:p>
     <w:p>
       <w:pPr>
@@ -917,7 +999,6 @@
       <w:pPr>
         <w:rPr>
           <w:rFonts w:ascii="Arial" w:hAnsi="Arial" w:cs="Arial"/>
-          <w:color w:val="7030A0"/>
         </w:rPr>
       </w:pPr>
       <w:r>
@@ -929,7 +1010,6 @@
       <w:r>
         <w:rPr>
           <w:rFonts w:ascii="Arial" w:hAnsi="Arial" w:cs="Arial"/>
-          <w:color w:val="7030A0"/>
           <w:highlight w:val="yellow"/>
         </w:rPr>
         <w:t xml:space="preserve">Statistical analyses were completed in R (v 4.2.3) using the </w:t>
@@ -939,7 +1019,6 @@
           <w:rFonts w:ascii="Arial" w:hAnsi="Arial" w:cs="Arial"/>
           <w:i/>
           <w:iCs/>
-          <w:color w:val="7030A0"/>
           <w:highlight w:val="yellow"/>
         </w:rPr>
         <w:t>lme4</w:t>
@@ -947,21 +1026,30 @@
       <w:r>
         <w:rPr>
           <w:rFonts w:ascii="Arial" w:hAnsi="Arial" w:cs="Arial"/>
-          <w:color w:val="7030A0"/>
           <w:highlight w:val="yellow"/>
         </w:rPr>
         <w:t xml:space="preserve"> package. Models involving only fixed effects used the </w:t>
       </w:r>
+      <w:proofErr w:type="spellStart"/>
       <w:proofErr w:type="gramStart"/>
       <w:r>
         <w:rPr>
           <w:rFonts w:ascii="Arial" w:hAnsi="Arial" w:cs="Arial"/>
           <w:i/>
           <w:iCs/>
-          <w:color w:val="7030A0"/>
           <w:highlight w:val="yellow"/>
         </w:rPr>
-        <w:t>glm(</w:t>
+        <w:t>glm</w:t>
+      </w:r>
+      <w:proofErr w:type="spellEnd"/>
+      <w:r>
+        <w:rPr>
+          <w:rFonts w:ascii="Arial" w:hAnsi="Arial" w:cs="Arial"/>
+          <w:i/>
+          <w:iCs/>
+          <w:highlight w:val="yellow"/>
+        </w:rPr>
+        <w:t>(</w:t>
       </w:r>
       <w:proofErr w:type="gramEnd"/>
       <w:r>
@@ -969,7 +1057,6 @@
           <w:rFonts w:ascii="Arial" w:hAnsi="Arial" w:cs="Arial"/>
           <w:i/>
           <w:iCs/>
-          <w:color w:val="7030A0"/>
           <w:highlight w:val="yellow"/>
         </w:rPr>
         <w:t>)</w:t>
@@ -977,43 +1064,51 @@
       <w:r>
         <w:rPr>
           <w:rFonts w:ascii="Arial" w:hAnsi="Arial" w:cs="Arial"/>
-          <w:color w:val="7030A0"/>
           <w:highlight w:val="yellow"/>
         </w:rPr>
         <w:t xml:space="preserve"> function while the inclusion of random effects required employing </w:t>
       </w:r>
+      <w:proofErr w:type="spellStart"/>
       <w:r>
         <w:rPr>
           <w:rFonts w:ascii="Arial" w:hAnsi="Arial" w:cs="Arial"/>
           <w:i/>
           <w:iCs/>
-          <w:color w:val="7030A0"/>
           <w:highlight w:val="yellow"/>
         </w:rPr>
-        <w:t>glmer()</w:t>
+        <w:t>glmer</w:t>
+      </w:r>
+      <w:proofErr w:type="spellEnd"/>
+      <w:r>
+        <w:rPr>
+          <w:rFonts w:ascii="Arial" w:hAnsi="Arial" w:cs="Arial"/>
+          <w:i/>
+          <w:iCs/>
+          <w:highlight w:val="yellow"/>
+        </w:rPr>
+        <w:t>()</w:t>
       </w:r>
       <w:r>
         <w:rPr>
           <w:rFonts w:ascii="Arial" w:hAnsi="Arial" w:cs="Arial"/>
-          <w:color w:val="7030A0"/>
           <w:highlight w:val="yellow"/>
         </w:rPr>
         <w:t xml:space="preserve">. Post-hoc analyses were completed using pairwise comparisons in the </w:t>
       </w:r>
+      <w:proofErr w:type="spellStart"/>
       <w:r>
         <w:rPr>
           <w:rFonts w:ascii="Arial" w:hAnsi="Arial" w:cs="Arial"/>
           <w:i/>
           <w:iCs/>
-          <w:color w:val="7030A0"/>
           <w:highlight w:val="yellow"/>
         </w:rPr>
         <w:t>emmeans</w:t>
       </w:r>
+      <w:proofErr w:type="spellEnd"/>
       <w:r>
         <w:rPr>
           <w:rFonts w:ascii="Arial" w:hAnsi="Arial" w:cs="Arial"/>
-          <w:color w:val="7030A0"/>
           <w:highlight w:val="yellow"/>
         </w:rPr>
         <w:t xml:space="preserve"> package.</w:t>
@@ -1021,7 +1116,6 @@
       <w:r>
         <w:rPr>
           <w:rFonts w:ascii="Arial" w:hAnsi="Arial" w:cs="Arial"/>
-          <w:color w:val="7030A0"/>
         </w:rPr>
         <w:t xml:space="preserve"> </w:t>
       </w:r>
@@ -1055,7 +1149,6 @@
         <w:ind w:firstLine="720"/>
         <w:rPr>
           <w:rFonts w:ascii="Arial" w:hAnsi="Arial" w:cs="Arial"/>
-          <w:color w:val="7030A0"/>
         </w:rPr>
       </w:pPr>
       <w:r>
@@ -1063,15 +1156,7 @@
           <w:rFonts w:ascii="Arial" w:hAnsi="Arial" w:cs="Arial"/>
           <w:highlight w:val="yellow"/>
         </w:rPr>
-        <w:t xml:space="preserve">Mixed effects logistic regression was used with a binomial distribution and a “logit” link function, with stress hardening temperature and tide treatments as well as marine heatwave temperatures as fixed effects. Tank was included as a random effect to account for non-independent samples within tanks. </w:t>
-      </w:r>
-      <w:r>
-        <w:rPr>
-          <w:rFonts w:ascii="Arial" w:hAnsi="Arial" w:cs="Arial"/>
-          <w:color w:val="7030A0"/>
-          <w:highlight w:val="yellow"/>
-        </w:rPr>
-        <w:t>X, Y, and Z were completed to test for assumptions concerning x, y, and z, respectively.</w:t>
+        <w:t>Mixed effects logistic regression was used with a binomial distribution and a “logit” link function, with stress hardening temperature and tide treatments as well as marine heatwave temperatures as fixed effects. Tank was included as a random effect to account for non-independent samples within tanks. X, Y, and Z were completed to test for assumptions concerning x, y, and z, respectively.</w:t>
       </w:r>
     </w:p>
     <w:p>
@@ -1144,7 +1229,6 @@
       <w:pPr>
         <w:rPr>
           <w:rFonts w:ascii="Arial" w:hAnsi="Arial" w:cs="Arial"/>
-          <w:color w:val="7030A0"/>
         </w:rPr>
       </w:pPr>
       <w:r>
@@ -1152,7 +1236,6 @@
           <w:rFonts w:ascii="Arial" w:hAnsi="Arial" w:cs="Arial"/>
           <w:i/>
           <w:iCs/>
-          <w:color w:val="7030A0"/>
         </w:rPr>
         <w:tab/>
       </w:r>
@@ -1161,7 +1244,6 @@
           <w:rFonts w:ascii="Arial" w:hAnsi="Arial" w:cs="Arial"/>
           <w:i/>
           <w:iCs/>
-          <w:color w:val="7030A0"/>
           <w:highlight w:val="yellow"/>
         </w:rPr>
         <w:t xml:space="preserve">Condition Index - </w:t>
@@ -1169,7 +1251,6 @@
       <w:r>
         <w:rPr>
           <w:rFonts w:ascii="Arial" w:hAnsi="Arial" w:cs="Arial"/>
-          <w:color w:val="7030A0"/>
           <w:highlight w:val="yellow"/>
         </w:rPr>
         <w:t xml:space="preserve">Generalized linear mixed effects models were used to assess shell length and condition index. For </w:t>
@@ -1179,15 +1260,24 @@
           <w:rFonts w:ascii="Arial" w:hAnsi="Arial" w:cs="Arial"/>
           <w:i/>
           <w:iCs/>
-          <w:color w:val="7030A0"/>
           <w:highlight w:val="yellow"/>
         </w:rPr>
-        <w:t>O. lurida</w:t>
+        <w:t xml:space="preserve">O. </w:t>
       </w:r>
+      <w:proofErr w:type="spellStart"/>
       <w:r>
         <w:rPr>
           <w:rFonts w:ascii="Arial" w:hAnsi="Arial" w:cs="Arial"/>
-          <w:color w:val="7030A0"/>
+          <w:i/>
+          <w:iCs/>
+          <w:highlight w:val="yellow"/>
+        </w:rPr>
+        <w:t>lurida</w:t>
+      </w:r>
+      <w:proofErr w:type="spellEnd"/>
+      <w:r>
+        <w:rPr>
+          <w:rFonts w:ascii="Arial" w:hAnsi="Arial" w:cs="Arial"/>
           <w:highlight w:val="yellow"/>
         </w:rPr>
         <w:t>, a gamma distribution was used, while a gaussian distribution was used for the other two species; with “identity” link function was used.</w:t>
@@ -1218,6 +1308,7 @@
           <w:iCs/>
           <w:color w:val="FF0000"/>
         </w:rPr>
+        <w:lastRenderedPageBreak/>
         <w:t>PHYSIOLOGY</w:t>
       </w:r>
       <w:r>
@@ -1254,22 +1345,18 @@
       <w:pPr>
         <w:rPr>
           <w:rFonts w:ascii="Arial" w:hAnsi="Arial" w:cs="Arial"/>
-          <w:color w:val="7030A0"/>
         </w:rPr>
       </w:pPr>
       <w:r>
         <w:rPr>
           <w:rFonts w:ascii="Arial" w:hAnsi="Arial" w:cs="Arial"/>
-          <w:color w:val="7030A0"/>
           <w:highlight w:val="yellow"/>
         </w:rPr>
-        <w:lastRenderedPageBreak/>
         <w:t>All models were compared to a null model with AIC and BIC scores used to determine the best fitting model.</w:t>
       </w:r>
       <w:r>
         <w:rPr>
           <w:rFonts w:ascii="Arial" w:hAnsi="Arial" w:cs="Arial"/>
-          <w:color w:val="7030A0"/>
         </w:rPr>
         <w:t xml:space="preserve"> </w:t>
       </w:r>
@@ -1316,6 +1403,302 @@
         </w:rPr>
         <w:t>RESULTS</w:t>
       </w:r>
+    </w:p>
+    <w:p>
+      <w:pPr>
+        <w:rPr>
+          <w:rFonts w:ascii="Arial" w:hAnsi="Arial" w:cs="Arial"/>
+          <w:i/>
+          <w:iCs/>
+        </w:rPr>
+      </w:pPr>
+      <w:r>
+        <w:rPr>
+          <w:rFonts w:ascii="Arial" w:hAnsi="Arial" w:cs="Arial"/>
+          <w:i/>
+          <w:iCs/>
+        </w:rPr>
+        <w:t>TEMPERATURE</w:t>
+      </w:r>
+    </w:p>
+    <w:p>
+      <w:pPr>
+        <w:rPr>
+          <w:rFonts w:ascii="Arial" w:hAnsi="Arial" w:cs="Arial"/>
+          <w:i/>
+          <w:iCs/>
+        </w:rPr>
+      </w:pPr>
+      <w:r>
+        <w:rPr>
+          <w:rFonts w:ascii="Arial" w:hAnsi="Arial" w:cs="Arial"/>
+          <w:i/>
+          <w:iCs/>
+        </w:rPr>
+        <w:t>CHLOROPHYLL</w:t>
+      </w:r>
+    </w:p>
+    <w:p>
+      <w:pPr>
+        <w:rPr>
+          <w:rFonts w:ascii="Arial" w:hAnsi="Arial" w:cs="Arial"/>
+          <w:b/>
+          <w:bCs/>
+          <w:color w:val="7030A0"/>
+        </w:rPr>
+      </w:pPr>
+      <w:r>
+        <w:rPr>
+          <w:rFonts w:ascii="Arial" w:hAnsi="Arial" w:cs="Arial"/>
+          <w:b/>
+          <w:bCs/>
+          <w:color w:val="7030A0"/>
+        </w:rPr>
+        <w:t xml:space="preserve">Seawater equation: </w:t>
+      </w:r>
+    </w:p>
+    <w:p>
+      <w:pPr>
+        <w:jc w:val="center"/>
+        <w:rPr>
+          <w:rFonts w:ascii="Arial" w:hAnsi="Arial" w:cs="Arial"/>
+          <w:color w:val="7030A0"/>
+          <w:shd w:val="clear" w:color="auto" w:fill="FFFFFF"/>
+        </w:rPr>
+      </w:pPr>
+      <w:proofErr w:type="spellStart"/>
+      <w:r>
+        <w:rPr>
+          <w:rFonts w:ascii="Arial" w:hAnsi="Arial" w:cs="Arial"/>
+          <w:color w:val="7030A0"/>
+          <w:shd w:val="clear" w:color="auto" w:fill="FFFFFF"/>
+        </w:rPr>
+        <w:t>Chl</w:t>
+      </w:r>
+      <w:proofErr w:type="spellEnd"/>
+      <w:r>
+        <w:rPr>
+          <w:rFonts w:ascii="Arial" w:hAnsi="Arial" w:cs="Arial"/>
+          <w:color w:val="7030A0"/>
+          <w:shd w:val="clear" w:color="auto" w:fill="FFFFFF"/>
+        </w:rPr>
+        <w:t xml:space="preserve"> a </w:t>
+      </w:r>
+      <w:proofErr w:type="gramStart"/>
+      <w:r>
+        <w:rPr>
+          <w:rFonts w:ascii="Arial" w:hAnsi="Arial" w:cs="Arial"/>
+          <w:color w:val="7030A0"/>
+          <w:shd w:val="clear" w:color="auto" w:fill="FFFFFF"/>
+        </w:rPr>
+        <w:t>( mg</w:t>
+      </w:r>
+      <w:proofErr w:type="gramEnd"/>
+      <w:r>
+        <w:rPr>
+          <w:rFonts w:ascii="Arial" w:hAnsi="Arial" w:cs="Arial"/>
+          <w:color w:val="7030A0"/>
+          <w:shd w:val="clear" w:color="auto" w:fill="FFFFFF"/>
+        </w:rPr>
+        <w:t>/m^-3) = K*((E665o − E750o) − (E665a − E750a))*</w:t>
+      </w:r>
+      <w:proofErr w:type="spellStart"/>
+      <w:r>
+        <w:rPr>
+          <w:rFonts w:ascii="Arial" w:hAnsi="Arial" w:cs="Arial"/>
+          <w:color w:val="7030A0"/>
+          <w:shd w:val="clear" w:color="auto" w:fill="FFFFFF"/>
+        </w:rPr>
+        <w:t>Ve</w:t>
+      </w:r>
+      <w:proofErr w:type="spellEnd"/>
+      <w:r>
+        <w:rPr>
+          <w:rFonts w:ascii="Arial" w:hAnsi="Arial" w:cs="Arial"/>
+          <w:color w:val="7030A0"/>
+          <w:shd w:val="clear" w:color="auto" w:fill="FFFFFF"/>
+        </w:rPr>
+        <w:t xml:space="preserve"> /L*</w:t>
+      </w:r>
+      <w:proofErr w:type="spellStart"/>
+      <w:r>
+        <w:rPr>
+          <w:rFonts w:ascii="Arial" w:hAnsi="Arial" w:cs="Arial"/>
+          <w:color w:val="7030A0"/>
+          <w:shd w:val="clear" w:color="auto" w:fill="FFFFFF"/>
+        </w:rPr>
+        <w:t>Vf</w:t>
+      </w:r>
+      <w:proofErr w:type="spellEnd"/>
+    </w:p>
+    <w:p>
+      <w:pPr>
+        <w:rPr>
+          <w:rFonts w:ascii="Arial" w:hAnsi="Arial" w:cs="Arial"/>
+          <w:color w:val="7030A0"/>
+          <w:shd w:val="clear" w:color="auto" w:fill="FFFFFF"/>
+        </w:rPr>
+      </w:pPr>
+      <w:r>
+        <w:rPr>
+          <w:rFonts w:ascii="Arial" w:hAnsi="Arial" w:cs="Arial"/>
+          <w:color w:val="7030A0"/>
+          <w:shd w:val="clear" w:color="auto" w:fill="FFFFFF"/>
+        </w:rPr>
+        <w:t xml:space="preserve">where R = 1.7, K = 2.43, L = 5cm, Vol ex = 5.8 mL, and Vol </w:t>
+      </w:r>
+      <w:proofErr w:type="spellStart"/>
+      <w:r>
+        <w:rPr>
+          <w:rFonts w:ascii="Arial" w:hAnsi="Arial" w:cs="Arial"/>
+          <w:color w:val="7030A0"/>
+          <w:shd w:val="clear" w:color="auto" w:fill="FFFFFF"/>
+        </w:rPr>
+        <w:t>filt</w:t>
+      </w:r>
+      <w:proofErr w:type="spellEnd"/>
+      <w:r>
+        <w:rPr>
+          <w:rFonts w:ascii="Arial" w:hAnsi="Arial" w:cs="Arial"/>
+          <w:color w:val="7030A0"/>
+          <w:shd w:val="clear" w:color="auto" w:fill="FFFFFF"/>
+        </w:rPr>
+        <w:t xml:space="preserve"> = 250mL)</w:t>
+      </w:r>
+    </w:p>
+    <w:p>
+      <w:pPr>
+        <w:rPr>
+          <w:rFonts w:ascii="Arial" w:hAnsi="Arial" w:cs="Arial"/>
+          <w:color w:val="7030A0"/>
+          <w:shd w:val="clear" w:color="auto" w:fill="FFFFFF"/>
+        </w:rPr>
+      </w:pPr>
+      <w:r>
+        <w:rPr>
+          <w:rFonts w:ascii="Arial" w:hAnsi="Arial" w:cs="Arial"/>
+          <w:color w:val="7030A0"/>
+          <w:shd w:val="clear" w:color="auto" w:fill="FFFFFF"/>
+        </w:rPr>
+        <w:tab/>
+      </w:r>
+    </w:p>
+    <w:p>
+      <w:pPr>
+        <w:rPr>
+          <w:rFonts w:ascii="Arial" w:hAnsi="Arial" w:cs="Arial"/>
+          <w:b/>
+          <w:bCs/>
+          <w:color w:val="7030A0"/>
+          <w:shd w:val="clear" w:color="auto" w:fill="FFFFFF"/>
+        </w:rPr>
+      </w:pPr>
+      <w:r>
+        <w:rPr>
+          <w:rFonts w:ascii="Arial" w:hAnsi="Arial" w:cs="Arial"/>
+          <w:b/>
+          <w:bCs/>
+          <w:color w:val="7030A0"/>
+          <w:shd w:val="clear" w:color="auto" w:fill="FFFFFF"/>
+        </w:rPr>
+        <w:t xml:space="preserve">Benthic equation: </w:t>
+      </w:r>
+    </w:p>
+    <w:p>
+      <w:pPr>
+        <w:jc w:val="center"/>
+        <w:rPr>
+          <w:rFonts w:ascii="Arial" w:hAnsi="Arial" w:cs="Arial"/>
+          <w:color w:val="7030A0"/>
+          <w:shd w:val="clear" w:color="auto" w:fill="FFFFFF"/>
+        </w:rPr>
+      </w:pPr>
+      <w:r>
+        <w:rPr>
+          <w:rFonts w:ascii="Arial" w:hAnsi="Arial" w:cs="Arial"/>
+          <w:color w:val="7030A0"/>
+          <w:shd w:val="clear" w:color="auto" w:fill="FFFFFF"/>
+        </w:rPr>
+        <w:t xml:space="preserve">(26.7 </w:t>
+      </w:r>
+      <w:r>
+        <w:rPr>
+          <w:rFonts w:ascii="Arial" w:hAnsi="Arial" w:cs="Arial"/>
+          <w:color w:val="7030A0"/>
+          <w:shd w:val="clear" w:color="auto" w:fill="FFFFFF"/>
+        </w:rPr>
+        <w:t>*</w:t>
+      </w:r>
+      <w:r>
+        <w:rPr>
+          <w:rFonts w:ascii="Arial" w:hAnsi="Arial" w:cs="Arial"/>
+          <w:color w:val="7030A0"/>
+          <w:shd w:val="clear" w:color="auto" w:fill="FFFFFF"/>
+        </w:rPr>
+        <w:t xml:space="preserve"> ((665o - 750o) - (665a - 750a)) </w:t>
+      </w:r>
+      <w:r>
+        <w:rPr>
+          <w:rFonts w:ascii="Arial" w:hAnsi="Arial" w:cs="Arial"/>
+          <w:color w:val="7030A0"/>
+          <w:shd w:val="clear" w:color="auto" w:fill="FFFFFF"/>
+        </w:rPr>
+        <w:t>*</w:t>
+      </w:r>
+      <w:r>
+        <w:rPr>
+          <w:rFonts w:ascii="Arial" w:hAnsi="Arial" w:cs="Arial"/>
+          <w:color w:val="7030A0"/>
+          <w:shd w:val="clear" w:color="auto" w:fill="FFFFFF"/>
+        </w:rPr>
+        <w:t xml:space="preserve"> v)</w:t>
+      </w:r>
+      <w:r>
+        <w:rPr>
+          <w:rFonts w:ascii="Arial" w:hAnsi="Arial" w:cs="Arial"/>
+          <w:color w:val="7030A0"/>
+          <w:shd w:val="clear" w:color="auto" w:fill="FFFFFF"/>
+        </w:rPr>
+        <w:t>,</w:t>
+      </w:r>
+    </w:p>
+    <w:p>
+      <w:pPr>
+        <w:tabs>
+          <w:tab w:val="center" w:pos="4680"/>
+        </w:tabs>
+        <w:rPr>
+          <w:rFonts w:ascii="Arial" w:hAnsi="Arial" w:cs="Arial"/>
+          <w:color w:val="7030A0"/>
+          <w:shd w:val="clear" w:color="auto" w:fill="FFFFFF"/>
+        </w:rPr>
+      </w:pPr>
+      <w:r>
+        <w:rPr>
+          <w:rFonts w:ascii="Arial" w:hAnsi="Arial" w:cs="Arial"/>
+          <w:color w:val="7030A0"/>
+          <w:shd w:val="clear" w:color="auto" w:fill="FFFFFF"/>
+        </w:rPr>
+        <w:t>where A = 1.23 cm2, and v = 6mL)</w:t>
+      </w:r>
+    </w:p>
+    <w:p>
+      <w:pPr>
+        <w:rPr>
+          <w:rFonts w:ascii="Arial" w:hAnsi="Arial" w:cs="Arial"/>
+          <w:color w:val="7030A0"/>
+          <w:shd w:val="clear" w:color="auto" w:fill="FFFFFF"/>
+        </w:rPr>
+      </w:pPr>
+    </w:p>
+    <w:p>
+      <w:pPr>
+        <w:rPr>
+          <w:rFonts w:ascii="Arial" w:hAnsi="Arial" w:cs="Arial"/>
+          <w:i/>
+          <w:iCs/>
+        </w:rPr>
+      </w:pPr>
     </w:p>
     <w:p>
       <w:pPr>
@@ -2053,6 +2436,7 @@
                 <w:color w:val="FF0000"/>
               </w:rPr>
             </w:pPr>
+            <w:proofErr w:type="spellStart"/>
             <w:r>
               <w:rPr>
                 <w:rFonts w:ascii="Arial" w:hAnsi="Arial" w:cs="Arial"/>
@@ -2062,6 +2446,7 @@
               </w:rPr>
               <w:t>df</w:t>
             </w:r>
+            <w:proofErr w:type="spellEnd"/>
           </w:p>
         </w:tc>
         <w:tc>
@@ -2151,8 +2536,23 @@
                 <w:sz w:val="18"/>
                 <w:szCs w:val="18"/>
               </w:rPr>
-              <w:t>Ostrea lurida</w:t>
-            </w:r>
+              <w:t xml:space="preserve">Ostrea </w:t>
+            </w:r>
+            <w:proofErr w:type="spellStart"/>
+            <w:r>
+              <w:rPr>
+                <w:rFonts w:ascii="Arial" w:hAnsi="Arial" w:cs="Arial"/>
+                <w:b/>
+                <w:bCs/>
+                <w:i/>
+                <w:iCs/>
+                <w:color w:val="FF0000"/>
+                <w:sz w:val="18"/>
+                <w:szCs w:val="18"/>
+              </w:rPr>
+              <w:t>lurida</w:t>
+            </w:r>
+            <w:proofErr w:type="spellEnd"/>
           </w:p>
         </w:tc>
         <w:tc>
@@ -5870,8 +6270,23 @@
                 <w:sz w:val="18"/>
                 <w:szCs w:val="18"/>
               </w:rPr>
-              <w:t>Crassostrea sikamea</w:t>
-            </w:r>
+              <w:t xml:space="preserve">Crassostrea </w:t>
+            </w:r>
+            <w:proofErr w:type="spellStart"/>
+            <w:r>
+              <w:rPr>
+                <w:rFonts w:ascii="Arial" w:hAnsi="Arial" w:cs="Arial"/>
+                <w:b/>
+                <w:bCs/>
+                <w:i/>
+                <w:iCs/>
+                <w:color w:val="FF0000"/>
+                <w:sz w:val="18"/>
+                <w:szCs w:val="18"/>
+              </w:rPr>
+              <w:t>sikamea</w:t>
+            </w:r>
+            <w:proofErr w:type="spellEnd"/>
           </w:p>
         </w:tc>
         <w:tc>
@@ -8958,6 +9373,7 @@
                 <w:szCs w:val="18"/>
               </w:rPr>
             </w:pPr>
+            <w:proofErr w:type="spellStart"/>
             <w:r>
               <w:rPr>
                 <w:rFonts w:ascii="Arial" w:hAnsi="Arial" w:cs="Arial"/>
@@ -8969,7 +9385,21 @@
                 <w:sz w:val="18"/>
                 <w:szCs w:val="18"/>
               </w:rPr>
-              <w:t>Magallana gigas</w:t>
+              <w:t>Magallana</w:t>
+            </w:r>
+            <w:proofErr w:type="spellEnd"/>
+            <w:r>
+              <w:rPr>
+                <w:rFonts w:ascii="Arial" w:hAnsi="Arial" w:cs="Arial"/>
+                <w:b/>
+                <w:bCs/>
+                <w:i/>
+                <w:iCs/>
+                <w:color w:val="FF0000"/>
+                <w:sz w:val="18"/>
+                <w:szCs w:val="18"/>
+              </w:rPr>
+              <w:t xml:space="preserve"> gigas</w:t>
             </w:r>
           </w:p>
         </w:tc>
@@ -11380,17 +11810,9 @@
           <w:sz w:val="28"/>
           <w:szCs w:val="28"/>
         </w:rPr>
-        <w:t>O. lurida</w:t>
+        <w:t xml:space="preserve">O. </w:t>
       </w:r>
-      <w:r>
-        <w:rPr>
-          <w:rFonts w:ascii="Arial" w:hAnsi="Arial" w:cs="Arial"/>
-          <w:color w:val="FF0000"/>
-          <w:sz w:val="28"/>
-          <w:szCs w:val="28"/>
-        </w:rPr>
-        <w:t xml:space="preserve">, </w:t>
-      </w:r>
+      <w:proofErr w:type="spellStart"/>
       <w:r>
         <w:rPr>
           <w:rFonts w:ascii="Arial" w:hAnsi="Arial" w:cs="Arial"/>
@@ -11400,7 +11822,52 @@
           <w:sz w:val="28"/>
           <w:szCs w:val="28"/>
         </w:rPr>
-        <w:t>C. sikamea,</w:t>
+        <w:t>lurida</w:t>
+      </w:r>
+      <w:proofErr w:type="spellEnd"/>
+      <w:r>
+        <w:rPr>
+          <w:rFonts w:ascii="Arial" w:hAnsi="Arial" w:cs="Arial"/>
+          <w:color w:val="FF0000"/>
+          <w:sz w:val="28"/>
+          <w:szCs w:val="28"/>
+        </w:rPr>
+        <w:t xml:space="preserve">, </w:t>
+      </w:r>
+      <w:r>
+        <w:rPr>
+          <w:rFonts w:ascii="Arial" w:hAnsi="Arial" w:cs="Arial"/>
+          <w:i/>
+          <w:iCs/>
+          <w:color w:val="FF0000"/>
+          <w:sz w:val="28"/>
+          <w:szCs w:val="28"/>
+        </w:rPr>
+        <w:t xml:space="preserve">C. </w:t>
+      </w:r>
+      <w:proofErr w:type="spellStart"/>
+      <w:r>
+        <w:rPr>
+          <w:rFonts w:ascii="Arial" w:hAnsi="Arial" w:cs="Arial"/>
+          <w:i/>
+          <w:iCs/>
+          <w:color w:val="FF0000"/>
+          <w:sz w:val="28"/>
+          <w:szCs w:val="28"/>
+        </w:rPr>
+        <w:t>sikamea</w:t>
+      </w:r>
+      <w:proofErr w:type="spellEnd"/>
+      <w:r>
+        <w:rPr>
+          <w:rFonts w:ascii="Arial" w:hAnsi="Arial" w:cs="Arial"/>
+          <w:i/>
+          <w:iCs/>
+          <w:color w:val="FF0000"/>
+          <w:sz w:val="28"/>
+          <w:szCs w:val="28"/>
+        </w:rPr>
+        <w:t>,</w:t>
       </w:r>
       <w:r>
         <w:rPr>
@@ -11615,6 +12082,7 @@
                 <w:color w:val="FF0000"/>
               </w:rPr>
             </w:pPr>
+            <w:proofErr w:type="spellStart"/>
             <w:r>
               <w:rPr>
                 <w:rFonts w:ascii="Arial" w:hAnsi="Arial" w:cs="Arial"/>
@@ -11624,6 +12092,7 @@
               </w:rPr>
               <w:t>df</w:t>
             </w:r>
+            <w:proofErr w:type="spellEnd"/>
           </w:p>
         </w:tc>
         <w:tc>
@@ -11717,8 +12186,21 @@
                 <w:iCs/>
                 <w:color w:val="FF0000"/>
               </w:rPr>
-              <w:t>Ostrea lurida</w:t>
-            </w:r>
+              <w:t xml:space="preserve">Ostrea </w:t>
+            </w:r>
+            <w:proofErr w:type="spellStart"/>
+            <w:r>
+              <w:rPr>
+                <w:rFonts w:ascii="Arial" w:hAnsi="Arial" w:cs="Arial"/>
+                <w:b/>
+                <w:bCs/>
+                <w:i/>
+                <w:iCs/>
+                <w:color w:val="FF0000"/>
+              </w:rPr>
+              <w:t>lurida</w:t>
+            </w:r>
+            <w:proofErr w:type="spellEnd"/>
           </w:p>
         </w:tc>
         <w:tc>
@@ -13329,8 +13811,21 @@
                 <w:iCs/>
                 <w:color w:val="FF0000"/>
               </w:rPr>
-              <w:t>Crassostrea sikamea</w:t>
-            </w:r>
+              <w:t xml:space="preserve">Crassostrea </w:t>
+            </w:r>
+            <w:proofErr w:type="spellStart"/>
+            <w:r>
+              <w:rPr>
+                <w:rFonts w:ascii="Arial" w:hAnsi="Arial" w:cs="Arial"/>
+                <w:b/>
+                <w:bCs/>
+                <w:i/>
+                <w:iCs/>
+                <w:color w:val="FF0000"/>
+              </w:rPr>
+              <w:t>sikamea</w:t>
+            </w:r>
+            <w:proofErr w:type="spellEnd"/>
           </w:p>
         </w:tc>
         <w:tc>
@@ -14921,6 +15416,7 @@
                 <w:color w:val="FF0000"/>
               </w:rPr>
             </w:pPr>
+            <w:proofErr w:type="spellStart"/>
             <w:r>
               <w:rPr>
                 <w:rFonts w:ascii="Arial" w:hAnsi="Arial" w:cs="Arial"/>
@@ -14930,8 +15426,33 @@
                 <w:iCs/>
                 <w:color w:val="FF0000"/>
               </w:rPr>
-              <w:t>Magallana gigaas</w:t>
-            </w:r>
+              <w:t>Magallana</w:t>
+            </w:r>
+            <w:proofErr w:type="spellEnd"/>
+            <w:r>
+              <w:rPr>
+                <w:rFonts w:ascii="Arial" w:hAnsi="Arial" w:cs="Arial"/>
+                <w:b/>
+                <w:bCs/>
+                <w:i/>
+                <w:iCs/>
+                <w:color w:val="FF0000"/>
+              </w:rPr>
+              <w:t xml:space="preserve"> </w:t>
+            </w:r>
+            <w:proofErr w:type="spellStart"/>
+            <w:r>
+              <w:rPr>
+                <w:rFonts w:ascii="Arial" w:hAnsi="Arial" w:cs="Arial"/>
+                <w:b/>
+                <w:bCs/>
+                <w:i/>
+                <w:iCs/>
+                <w:color w:val="FF0000"/>
+              </w:rPr>
+              <w:t>gigaas</w:t>
+            </w:r>
+            <w:proofErr w:type="spellEnd"/>
           </w:p>
         </w:tc>
         <w:tc>
@@ -16895,8 +17416,23 @@
                 <w:sz w:val="18"/>
                 <w:szCs w:val="18"/>
               </w:rPr>
-              <w:t>Ostrea lurida</w:t>
-            </w:r>
+              <w:t xml:space="preserve">Ostrea </w:t>
+            </w:r>
+            <w:proofErr w:type="spellStart"/>
+            <w:r>
+              <w:rPr>
+                <w:rFonts w:ascii="Arial" w:hAnsi="Arial" w:cs="Arial"/>
+                <w:b/>
+                <w:bCs/>
+                <w:i/>
+                <w:iCs/>
+                <w:color w:val="FF0000"/>
+                <w:sz w:val="18"/>
+                <w:szCs w:val="18"/>
+              </w:rPr>
+              <w:t>lurida</w:t>
+            </w:r>
+            <w:proofErr w:type="spellEnd"/>
           </w:p>
         </w:tc>
         <w:tc>
@@ -18283,6 +18819,7 @@
                 <w:color w:val="FF0000"/>
               </w:rPr>
             </w:pPr>
+            <w:proofErr w:type="spellStart"/>
             <w:r>
               <w:rPr>
                 <w:rFonts w:ascii="Arial" w:hAnsi="Arial" w:cs="Arial"/>
@@ -18290,6 +18827,7 @@
               </w:rPr>
               <w:t>Outplanting</w:t>
             </w:r>
+            <w:proofErr w:type="spellEnd"/>
           </w:p>
         </w:tc>
         <w:tc>
@@ -18634,8 +19172,23 @@
                 <w:sz w:val="18"/>
                 <w:szCs w:val="18"/>
               </w:rPr>
-              <w:t>Crassostrea sikamea</w:t>
-            </w:r>
+              <w:t xml:space="preserve">Crassostrea </w:t>
+            </w:r>
+            <w:proofErr w:type="spellStart"/>
+            <w:r>
+              <w:rPr>
+                <w:rFonts w:ascii="Arial" w:hAnsi="Arial" w:cs="Arial"/>
+                <w:b/>
+                <w:bCs/>
+                <w:i/>
+                <w:iCs/>
+                <w:color w:val="FF0000"/>
+                <w:sz w:val="18"/>
+                <w:szCs w:val="18"/>
+              </w:rPr>
+              <w:t>sikamea</w:t>
+            </w:r>
+            <w:proofErr w:type="spellEnd"/>
           </w:p>
         </w:tc>
         <w:tc>
@@ -20012,6 +20565,7 @@
                 <w:szCs w:val="18"/>
               </w:rPr>
             </w:pPr>
+            <w:proofErr w:type="spellStart"/>
             <w:r>
               <w:rPr>
                 <w:rFonts w:ascii="Arial" w:hAnsi="Arial" w:cs="Arial"/>
@@ -20023,7 +20577,21 @@
                 <w:sz w:val="18"/>
                 <w:szCs w:val="18"/>
               </w:rPr>
-              <w:t>Magallana gigas</w:t>
+              <w:t>Magallana</w:t>
+            </w:r>
+            <w:proofErr w:type="spellEnd"/>
+            <w:r>
+              <w:rPr>
+                <w:rFonts w:ascii="Arial" w:hAnsi="Arial" w:cs="Arial"/>
+                <w:b/>
+                <w:bCs/>
+                <w:i/>
+                <w:iCs/>
+                <w:color w:val="FF0000"/>
+                <w:sz w:val="18"/>
+                <w:szCs w:val="18"/>
+              </w:rPr>
+              <w:t xml:space="preserve"> gigas</w:t>
             </w:r>
           </w:p>
         </w:tc>
@@ -21431,7 +21999,31 @@
           <w:sz w:val="28"/>
           <w:szCs w:val="28"/>
         </w:rPr>
-        <w:t xml:space="preserve">C. sikamea </w:t>
+        <w:t xml:space="preserve">C. </w:t>
+      </w:r>
+      <w:proofErr w:type="spellStart"/>
+      <w:r>
+        <w:rPr>
+          <w:rFonts w:ascii="Arial" w:hAnsi="Arial" w:cs="Arial"/>
+          <w:i/>
+          <w:iCs/>
+          <w:color w:val="FF0000"/>
+          <w:sz w:val="28"/>
+          <w:szCs w:val="28"/>
+        </w:rPr>
+        <w:t>sikamea</w:t>
+      </w:r>
+      <w:proofErr w:type="spellEnd"/>
+      <w:r>
+        <w:rPr>
+          <w:rFonts w:ascii="Arial" w:hAnsi="Arial" w:cs="Arial"/>
+          <w:i/>
+          <w:iCs/>
+          <w:color w:val="FF0000"/>
+          <w:sz w:val="28"/>
+          <w:szCs w:val="28"/>
+        </w:rPr>
+        <w:t xml:space="preserve"> </w:t>
       </w:r>
       <w:r>
         <w:rPr>

</xml_diff>

<commit_message>
made edits to Ch 2
</commit_message>
<xml_diff>
--- a/writing/Chapter 2.docx
+++ b/writing/Chapter 2.docx
@@ -12,6 +12,28 @@
           <w:szCs w:val="28"/>
         </w:rPr>
       </w:pPr>
+    </w:p>
+    <w:p>
+      <w:pPr>
+        <w:rPr>
+          <w:rFonts w:ascii="Arial" w:hAnsi="Arial" w:cs="Arial"/>
+          <w:b/>
+          <w:bCs/>
+          <w:sz w:val="28"/>
+          <w:szCs w:val="28"/>
+        </w:rPr>
+      </w:pPr>
+    </w:p>
+    <w:p>
+      <w:pPr>
+        <w:rPr>
+          <w:rFonts w:ascii="Arial" w:hAnsi="Arial" w:cs="Arial"/>
+          <w:b/>
+          <w:bCs/>
+          <w:sz w:val="28"/>
+          <w:szCs w:val="28"/>
+        </w:rPr>
+      </w:pPr>
       <w:r>
         <w:rPr>
           <w:rFonts w:ascii="Arial" w:hAnsi="Arial" w:cs="Arial"/>
@@ -661,6 +683,7 @@
           <w:i/>
           <w:iCs/>
         </w:rPr>
+        <w:lastRenderedPageBreak/>
         <w:t>Temperature in the Field</w:t>
       </w:r>
     </w:p>
@@ -719,14 +742,7 @@
         <w:rPr>
           <w:rFonts w:ascii="Arial" w:hAnsi="Arial" w:cs="Arial"/>
         </w:rPr>
-        <w:t xml:space="preserve"> to approximate </w:t>
-      </w:r>
-      <w:r>
-        <w:rPr>
-          <w:rFonts w:ascii="Arial" w:hAnsi="Arial" w:cs="Arial"/>
-        </w:rPr>
-        <w:lastRenderedPageBreak/>
-        <w:t xml:space="preserve">when oysters were experiencing high and low tide in </w:t>
+        <w:t xml:space="preserve"> to approximate when oysters were experiencing high and low tide in </w:t>
       </w:r>
       <w:proofErr w:type="spellStart"/>
       <w:r>
@@ -782,17 +798,7 @@
           <w:i/>
           <w:iCs/>
         </w:rPr>
-        <w:t>Chlorophyll</w:t>
-      </w:r>
-      <w:r>
-        <w:rPr>
-          <w:rFonts w:ascii="Arial" w:hAnsi="Arial" w:cs="Arial"/>
-          <w:b/>
-          <w:bCs/>
-          <w:i/>
-          <w:iCs/>
-        </w:rPr>
-        <w:t xml:space="preserve"> in the Field</w:t>
+        <w:t>Chlorophyll in the Field</w:t>
       </w:r>
     </w:p>
     <w:p>
@@ -1237,6 +1243,7 @@
           <w:i/>
           <w:iCs/>
         </w:rPr>
+        <w:lastRenderedPageBreak/>
         <w:tab/>
       </w:r>
       <w:r>
@@ -1308,7 +1315,6 @@
           <w:iCs/>
           <w:color w:val="FF0000"/>
         </w:rPr>
-        <w:lastRenderedPageBreak/>
         <w:t>PHYSIOLOGY</w:t>
       </w:r>
       <w:r>
@@ -1858,6 +1864,7 @@
           <w:iCs/>
           <w:color w:val="7030A0"/>
         </w:rPr>
+        <w:lastRenderedPageBreak/>
         <w:tab/>
       </w:r>
       <w:r>

</xml_diff>